<commit_message>
docs: establish product spec, retire stale PRD, lock single route
Add PRODUCT_DESIGN.md and AGENTS.md as the project's single source of
truth and collaboration rules, reconciling them with what is actually
shipped (archive/activity/progress pages, single-page five-step state
machine). Mark PRD-V0.3 as superseded in place since it still describes
an abandoned 3D/XR-Frame/AR direction that has no bearing on the
current native 2D grid experience.

Lock the product to a single foil-making route: remove
foil_application_candidate, which was a byte-for-byte duplicate of the
real route's steps with no home-page entry, from the frontend data
layer, both cloud function route allow-lists, and the CloudBase seed
data. Delete assets and the animation-frame data module that were
never referenced by any registered page, recovering bundle headroom
(1.99MB -> 1.48MB against the 2MB budget).

Co-Authored-By: Claude Sonnet 5 <noreply@anthropic.com>
</commit_message>
<xml_diff>
--- a/01_项目简报与产品需求/金箔非遗小程序产品需求文档PRD-V0.3.docx
+++ b/01_项目简报与产品需求/金箔非遗小程序产品需求文档PRD-V0.3.docx
@@ -2,6 +2,24 @@
 <file path=word/document.xml><?xml version="1.0" encoding="utf-8"?>
 <w:document xmlns:wpc="http://schemas.microsoft.com/office/word/2010/wordprocessingCanvas" xmlns:mo="http://schemas.microsoft.com/office/mac/office/2008/main" xmlns:mc="http://schemas.openxmlformats.org/markup-compatibility/2006" xmlns:mv="urn:schemas-microsoft-com:mac:vml" xmlns:o="urn:schemas-microsoft-com:office:office" xmlns:r="http://schemas.openxmlformats.org/officeDocument/2006/relationships" xmlns:m="http://schemas.openxmlformats.org/officeDocument/2006/math" xmlns:v="urn:schemas-microsoft-com:vml" xmlns:wp14="http://schemas.microsoft.com/office/word/2010/wordprocessingDrawing" xmlns:wp="http://schemas.openxmlformats.org/drawingml/2006/wordprocessingDrawing" xmlns:w10="urn:schemas-microsoft-com:office:word" xmlns:w="http://schemas.openxmlformats.org/wordprocessingml/2006/main" xmlns:w14="http://schemas.microsoft.com/office/word/2010/wordml" xmlns:wpg="http://schemas.microsoft.com/office/word/2010/wordprocessingGroup" xmlns:wpi="http://schemas.microsoft.com/office/word/2010/wordprocessingInk" xmlns:wne="http://schemas.microsoft.com/office/word/2006/wordml" xmlns:wps="http://schemas.microsoft.com/office/word/2010/wordprocessingShape" mc:Ignorable="w14 wp14">
   <w:body>
+    <w:p>
+      <w:pPr>
+        <w:pBdr>
+          <w:bottom w:val="single" w:sz="12" w:space="4" w:color="C0392B"/>
+        </w:pBdr>
+        <w:shd w:val="clear" w:fill="FBEAEA"/>
+        <w:spacing w:after="240"/>
+      </w:pPr>
+      <w:r>
+        <w:rPr>
+          <w:rFonts w:ascii="Microsoft YaHei" w:hAnsi="Microsoft YaHei" w:eastAsia="微软雅黑"/>
+          <w:b/>
+          <w:color w:val="C0392B"/>
+          <w:sz w:val="22"/>
+        </w:rPr>
+        <w:t xml:space="preserve">【已被取代 SUPERSEDED】本文件描述的“3分钟3D工艺互动 + XR-Frame / AR / GLB模型”技术方案已暂缓，不代表当前产品形态。当前实际产品为微信原生小程序的五步2D网格 + 手势交互体验（做捻子→装家生→打箔→出具检查→切箔成叶）。自2026-08-10起，项目的唯一事实来源改为仓库根目录的 PRODUCT_DESIGN.md，本文件仅作历史参考，不再同步更新。</w:t>
+      </w:r>
+    </w:p>
     <w:p>
       <w:pPr>
         <w:spacing w:before="200" w:after="80"/>

</xml_diff>